<commit_message>
Reescritura de documentos: mas contenido y lenguaje natural - Memoria, informe tecnico e informe ejecutivo ampliados y en voz de autor - Textos de la presentacion humanizados (maqueta intacta) - Retirados del repo los PDF desfasados (regenerar desde los .docx actualizados)
</commit_message>
<xml_diff>
--- a/informes/JAMSEC_Informe_Ejecutivo_Auditoria_Apex.docx
+++ b/informes/JAMSEC_Informe_Ejecutivo_Auditoria_Apex.docx
@@ -300,7 +300,7 @@
                 <w:b w:val="false"/>
                 <w:bCs w:val="false"/>
               </w:rPr>
-              <w:t xml:space="preserve">1 de junio de 2026</w:t>
+              <w:t xml:space="preserve">Junio de 2026</w:t>
             </w:r>
           </w:p>
         </w:tc>
@@ -451,15 +451,16 @@
         <w:pStyle w:val="Heading1"/>
       </w:pPr>
       <w:r>
-        <w:t xml:space="preserve">1. Propósito de este informe</w:t>
+        <w:t xml:space="preserve">1. De qué va este informe</w:t>
       </w:r>
     </w:p>
     <w:p>
       <w:pPr>
         <w:spacing w:after="140"/>
-      </w:pPr>
-      <w:r>
-        <w:t xml:space="preserve">Este documento resume, en lenguaje no técnico y orientado a la toma de decisiones, los resultados de la auditoría de seguridad que JAMSEC ha realizado sobre los sistemas informáticos de Apex Gestoría. El detalle técnico se encuentra en el informe técnico que acompaña a este resumen.</w:t>
+        <w:jc w:val="both"/>
+      </w:pPr>
+      <w:r>
+        <w:t xml:space="preserve">Apex Gestoría nos pidió que comprobáramos si sus sistemas informáticos son seguros. Para hacerlo, en JAMSEC simulamos un ataque real contra ellos, de forma controlada, y aquí resumimos lo que encontramos. Este documento está pensado para la dirección, así que va sin tecnicismos; el detalle técnico, con las pruebas y la forma de corregir cada problema, está en el informe técnico que entregamos aparte.</w:t>
       </w:r>
     </w:p>
     <w:p>
@@ -467,7 +468,7 @@
         <w:pStyle w:val="Heading1"/>
       </w:pPr>
       <w:r>
-        <w:t xml:space="preserve">2. Veredicto general</w:t>
+        <w:t xml:space="preserve">2. Conclusión principal</w:t>
       </w:r>
     </w:p>
     <w:tbl>
@@ -523,6 +524,7 @@
     <w:p>
       <w:pPr>
         <w:spacing w:after="140"/>
+        <w:jc w:val="both"/>
       </w:pPr>
       <w:r>
         <w:t xml:space="preserve"/>
@@ -531,9 +533,10 @@
     <w:p>
       <w:pPr>
         <w:spacing w:after="140"/>
-      </w:pPr>
-      <w:r>
-        <w:t xml:space="preserve">Durante la auditoría se logró tomar el control completo de los sistemas de la empresa y acceder a información confidencial de clientes y empleados (datos personales, bancarios y nóminas). Un atacante con conocimientos medios podría reproducir este ataque con poco esfuerzo y desde Internet.</w:t>
+        <w:jc w:val="both"/>
+      </w:pPr>
+      <w:r>
+        <w:t xml:space="preserve">Durante la prueba conseguimos hacernos con el control completo de los sistemas y acceder a información confidencial de clientes y empleados: datos personales, cuentas bancarias y nóminas. Y lo hicimos partiendo de cero, desde fuera, sin que nadie nos diera ninguna contraseña. Dicho de otro modo: hoy por hoy, alguien con conocimientos medios podría hacer lo mismo desde internet sin demasiado esfuerzo.</w:t>
       </w:r>
     </w:p>
     <w:p>
@@ -541,15 +544,16 @@
         <w:pStyle w:val="Heading1"/>
       </w:pPr>
       <w:r>
-        <w:t xml:space="preserve">3. Qué significa para el negocio</w:t>
+        <w:t xml:space="preserve">3. Qué supone esto para el negocio</w:t>
       </w:r>
     </w:p>
     <w:p>
       <w:pPr>
         <w:spacing w:after="140"/>
-      </w:pPr>
-      <w:r>
-        <w:t xml:space="preserve">Las debilidades encontradas exponen a Apex Gestoría a riesgos directos:</w:t>
+        <w:jc w:val="both"/>
+      </w:pPr>
+      <w:r>
+        <w:t xml:space="preserve">Más allá de lo técnico, lo que está en juego es el negocio. Estos son los riesgos concretos a los que se expone Apex con la situación actual:</w:t>
       </w:r>
     </w:p>
     <w:p>
@@ -562,7 +566,7 @@
         <w:spacing w:after="60"/>
       </w:pPr>
       <w:r>
-        <w:t xml:space="preserve">Robo de datos de clientes (NIF, cuentas bancarias, contactos) y de nóminas de empleados.</w:t>
+        <w:t xml:space="preserve">Que se roben los datos de los clientes (NIF, cuentas bancarias, contactos) y las nóminas de los empleados.</w:t>
       </w:r>
     </w:p>
     <w:p>
@@ -575,7 +579,7 @@
         <w:spacing w:after="60"/>
       </w:pPr>
       <w:r>
-        <w:t xml:space="preserve">Posibles sanciones por incumplimiento del Reglamento General de Protección de Datos (RGPD).</w:t>
+        <w:t xml:space="preserve">Sanciones por incumplir la Ley de Protección de Datos (RGPD), que para este tipo de información pueden ser elevadas.</w:t>
       </w:r>
     </w:p>
     <w:p>
@@ -588,7 +592,7 @@
         <w:spacing w:after="60"/>
       </w:pPr>
       <w:r>
-        <w:t xml:space="preserve">Daño reputacional y pérdida de confianza de los clientes ante una fuga de información.</w:t>
+        <w:t xml:space="preserve">Pérdida de confianza y daño a la reputación: una gestoría vive de que sus clientes le confíen datos sensibles.</w:t>
       </w:r>
     </w:p>
     <w:p>
@@ -601,7 +605,7 @@
         <w:spacing w:after="60"/>
       </w:pPr>
       <w:r>
-        <w:t xml:space="preserve">Riesgo de fraude o manipulación de la información contable y financiera.</w:t>
+        <w:t xml:space="preserve">Que alguien manipule o falsee información contable y financiera.</w:t>
       </w:r>
     </w:p>
     <w:p>
@@ -614,7 +618,7 @@
         <w:spacing w:after="60"/>
       </w:pPr>
       <w:r>
-        <w:t xml:space="preserve">Interrupción del servicio si un atacante decidiera cifrar o borrar los datos (ransomware).</w:t>
+        <w:t xml:space="preserve">Que un ataque tipo «ransomware» cifre o borre los datos y deje el negocio parado.</w:t>
       </w:r>
     </w:p>
     <w:p>
@@ -622,15 +626,16 @@
         <w:pStyle w:val="Heading1"/>
       </w:pPr>
       <w:r>
-        <w:t xml:space="preserve">4. Resumen de hallazgos</w:t>
+        <w:t xml:space="preserve">4. Resumen de lo que encontramos</w:t>
       </w:r>
     </w:p>
     <w:p>
       <w:pPr>
         <w:spacing w:after="140"/>
-      </w:pPr>
-      <w:r>
-        <w:t xml:space="preserve">Se identificaron 9 problemas de seguridad, clasificados por su gravedad:</w:t>
+        <w:jc w:val="both"/>
+      </w:pPr>
+      <w:r>
+        <w:t xml:space="preserve">En total detectamos 9 problemas de seguridad. Los clasificamos según su gravedad:</w:t>
       </w:r>
     </w:p>
     <w:tbl>
@@ -844,6 +849,7 @@
     <w:p>
       <w:pPr>
         <w:spacing w:after="140"/>
+        <w:jc w:val="both"/>
       </w:pPr>
       <w:r>
         <w:t xml:space="preserve"/>
@@ -852,13 +858,14 @@
     <w:p>
       <w:pPr>
         <w:spacing w:after="140"/>
+        <w:jc w:val="both"/>
       </w:pPr>
       <w:r>
         <w:rPr>
           <w:b/>
           <w:bCs/>
         </w:rPr>
-        <w:t xml:space="preserve">Los problemas más graves, explicados de forma sencilla:</w:t>
+        <w:t xml:space="preserve">Sin entrar en tecnicismos, los problemas más graves son estos:</w:t>
       </w:r>
     </w:p>
     <w:p>
@@ -871,7 +878,7 @@
         <w:spacing w:after="60"/>
       </w:pPr>
       <w:r>
-        <w:t xml:space="preserve">La página web de clientes permite saltarse el control de acceso y leer toda la base de datos (es la puerta de entrada principal).</w:t>
+        <w:t xml:space="preserve">La página web de clientes deja saltarse el control de acceso y, a través de ella, leer toda la base de datos. Es la puerta de entrada principal.</w:t>
       </w:r>
     </w:p>
     <w:p>
@@ -884,7 +891,7 @@
         <w:spacing w:after="60"/>
       </w:pPr>
       <w:r>
-        <w:t xml:space="preserve">La base de datos donde se guarda la información está accesible con una contraseña muy débil y conocida.</w:t>
+        <w:t xml:space="preserve">La base de datos donde se guarda todo está accesible con una contraseña muy débil y muy conocida.</w:t>
       </w:r>
     </w:p>
     <w:p>
@@ -897,7 +904,7 @@
         <w:spacing w:after="60"/>
       </w:pPr>
       <w:r>
-        <w:t xml:space="preserve">Un servicio de archivos permite descargar, sin contraseña, un documento que contiene las claves internas de la empresa.</w:t>
+        <w:t xml:space="preserve">Un servicio para compartir archivos permite descargar, sin pedir ninguna contraseña, un documento que contiene las claves internas de la empresa.</w:t>
       </w:r>
     </w:p>
     <w:p>
@@ -910,7 +917,16 @@
         <w:spacing w:after="60"/>
       </w:pPr>
       <w:r>
-        <w:t xml:space="preserve">Las redes internas no están bien separadas: entrar por la web da acceso directo a los datos sensibles.</w:t>
+        <w:t xml:space="preserve">Las redes internas no están bien separadas, así que entrar por la web da acceso directo a la información más sensible.</w:t>
+      </w:r>
+    </w:p>
+    <w:p>
+      <w:pPr>
+        <w:spacing w:after="140"/>
+        <w:jc w:val="both"/>
+      </w:pPr>
+      <w:r>
+        <w:t xml:space="preserve">Lo importante es entender que estos fallos no actúan por separado: uno lleva al siguiente. Aprovechando esa cadena fue como llegamos desde la web hasta las nóminas.</w:t>
       </w:r>
     </w:p>
     <w:p>
@@ -918,15 +934,16 @@
         <w:pStyle w:val="Heading1"/>
       </w:pPr>
       <w:r>
-        <w:t xml:space="preserve">5. Recomendaciones para la Dirección</w:t>
+        <w:t xml:space="preserve">5. Qué recomendamos hacer</w:t>
       </w:r>
     </w:p>
     <w:p>
       <w:pPr>
         <w:spacing w:after="140"/>
-      </w:pPr>
-      <w:r>
-        <w:t xml:space="preserve">JAMSEC recomienda actuar de forma escalonada, priorizando lo urgente:</w:t>
+        <w:jc w:val="both"/>
+      </w:pPr>
+      <w:r>
+        <w:t xml:space="preserve">La buena noticia es que casi todo se arregla con configuración y buenas prácticas, no hace falta una gran inversión. Proponemos actuar por fases, empezando por lo más urgente:</w:t>
       </w:r>
     </w:p>
     <w:tbl>
@@ -1068,7 +1085,7 @@
                 <w:b w:val="false"/>
                 <w:bCs w:val="false"/>
               </w:rPr>
-              <w:t xml:space="preserve">Corregir la página web vulnerable y cambiar todas las contraseñas, especialmente la de la base de datos.</w:t>
+              <w:t xml:space="preserve">Corregir la página web vulnerable y cambiar todas las contraseñas, sobre todo la de la base de datos.</w:t>
             </w:r>
           </w:p>
         </w:tc>
@@ -1130,7 +1147,7 @@
                 <w:b w:val="false"/>
                 <w:bCs w:val="false"/>
               </w:rPr>
-              <w:t xml:space="preserve">Cerrar los servicios expuestos a Internet, reforzar el acceso remoto y separar correctamente las redes internas.</w:t>
+              <w:t xml:space="preserve">Cerrar los servicios que están abiertos a internet sin necesidad, reforzar el acceso remoto y separar bien las redes internas.</w:t>
             </w:r>
           </w:p>
         </w:tc>
@@ -1192,7 +1209,7 @@
                 <w:b w:val="false"/>
                 <w:bCs w:val="false"/>
               </w:rPr>
-              <w:t xml:space="preserve">Cifrar todas las comunicaciones, implantar una política de contraseñas y formación básica de seguridad.</w:t>
+              <w:t xml:space="preserve">Cifrar todas las comunicaciones, establecer una política de contraseñas y dar una formación básica de seguridad al personal.</w:t>
             </w:r>
           </w:p>
         </w:tc>
@@ -1254,7 +1271,7 @@
                 <w:b w:val="false"/>
                 <w:bCs w:val="false"/>
               </w:rPr>
-              <w:t xml:space="preserve">Mantener la monitorización de seguridad (ya operativa) y repetir la auditoría periódicamente.</w:t>
+              <w:t xml:space="preserve">Mantener la vigilancia de seguridad (que ya está funcionando) y repetir la auditoría de vez en cuando.</w:t>
             </w:r>
           </w:p>
         </w:tc>
@@ -1265,15 +1282,16 @@
         <w:pStyle w:val="Heading1"/>
       </w:pPr>
       <w:r>
-        <w:t xml:space="preserve">6. Aspecto positivo</w:t>
+        <w:t xml:space="preserve">6. Lo que sí funciona</w:t>
       </w:r>
     </w:p>
     <w:p>
       <w:pPr>
         <w:spacing w:after="140"/>
-      </w:pPr>
-      <w:r>
-        <w:t xml:space="preserve">El sistema de monitorización de seguridad desplegado por JAMSEC (SIEM e IDS) detectó la actividad del ataque durante la auditoría: el escaneo de la red, los intentos de adivinar contraseñas y los accesos a los servicios. Esto demuestra que, una vez corregidas las vulnerabilidades, Apex Gestoría dispondrá de capacidad para detectar y reaccionar ante incidentes.</w:t>
+        <w:jc w:val="both"/>
+      </w:pPr>
+      <w:r>
+        <w:t xml:space="preserve">No todo son malas noticias. El sistema de vigilancia de seguridad que tiene desplegado JAMSEC detectó nuestro ataque mientras lo estábamos haciendo: vio el rastreo de la red, los intentos de adivinar contraseñas y los accesos. Esto es importante porque quiere decir que, una vez se corrijan los fallos, Apex no se queda «a ciegas»: dispone de la capacidad de darse cuenta de un ataque y reaccionar a tiempo.</w:t>
       </w:r>
     </w:p>
     <w:p>
@@ -1287,9 +1305,10 @@
     <w:p>
       <w:pPr>
         <w:spacing w:after="140"/>
-      </w:pPr>
-      <w:r>
-        <w:t xml:space="preserve">La situación actual es de riesgo crítico, pero subsanable. Aplicando las medidas recomendadas —especialmente las inmediatas— el nivel de exposición se reduciría drásticamente. JAMSEC queda a disposición de la Dirección para acompañar el proceso de corrección y verificar su eficacia mediante una nueva auditoría.</w:t>
+        <w:jc w:val="both"/>
+      </w:pPr>
+      <w:r>
+        <w:t xml:space="preserve">La situación de partida es de riesgo crítico, pero tiene arreglo y no es caro de solucionar. Si se aplican las medidas que proponemos, empezando por las urgentes, el nivel de exposición baja muchísimo en poco tiempo. Desde JAMSEC quedamos a disposición de la dirección para ayudar en la corrección y, cuando esté hecha, volver a comprobar que todo ha quedado bien cerrado.</w:t>
       </w:r>
     </w:p>
     <w:sectPr>

</xml_diff>